<commit_message>
docs(execution-plan): clarify layering vs STEP14_PLAN.md
Per operator question — make the doc relationship unambiguous in
the file itself.  Added a new "Relationship to STEP14_PLAN.md"
section at the top stating:

  - EXECUTION_PLAN.md is ADDED to (not replaces) STEP14_PLAN.md.
  - STEP14_PLAN.md = engineering blueprint ("WHAT").
  - EXECUTION_PLAN.md = operating discipline + progress tracking
    + 2-audit gate ("HOW we execute + what gates each step").
  - Both must be satisfied for a checkbox to be marked complete.
  - Explicitly answers the operator's two questions:
      "What happens before any code is written?"
       → Pre-Write Protocol + Rules 3, 4.
      "What happens before anything is confirmed as
       PARITY-LIKE-REFERENCE?"
       → 2-audit gate (Rule 6) + Verification Protocol steps
         10-12 + operator bench sign-off for bench-gated stages.

DOCX + PDF regenerated.

Co-Authored-By: Claude Opus 4.7 (1M context) <noreply@anthropic.com>
</commit_message>
<xml_diff>
--- a/docs/EXECUTION_PLAN.docx
+++ b/docs/EXECUTION_PLAN.docx
@@ -241,6 +241,287 @@
           <w:sz w:val="18"/>
         </w:rPr>
         <w:t>Co-Authored-By: Claude Opus 4.7 (1M context) &lt;noreply@anthropic.com&gt;</w:t>
+      </w:r>
+    </w:p>
+    <w:p>
+      <w:pPr>
+        <w:pBdr>
+          <w:bottom w:val="single" w:sz="6" w:color="808080"/>
+        </w:pBdr>
+      </w:pPr>
+    </w:p>
+    <w:p>
+      <w:pPr>
+        <w:pStyle w:val="Heading2"/>
+      </w:pPr>
+      <w:r>
+        <w:t>📚 RELATIONSHIP TO `STEP14_PLAN.md`</w:t>
+      </w:r>
+    </w:p>
+    <w:p>
+      <w:r>
+        <w:t xml:space="preserve">This document is </w:t>
+      </w:r>
+      <w:r>
+        <w:rPr>
+          <w:b/>
+        </w:rPr>
+        <w:t>ADDED</w:t>
+      </w:r>
+      <w:r>
+        <w:t xml:space="preserve"> to the existing </w:t>
+      </w:r>
+      <w:r>
+        <w:rPr>
+          <w:rFonts w:ascii="Consolas" w:hAnsi="Consolas"/>
+          <w:sz w:val="18"/>
+        </w:rPr>
+        <w:t>docs/architecture/STEP14_PLAN.md</w:t>
+      </w:r>
+      <w:r>
+        <w:t xml:space="preserve"> — not a replacement. The two docs stack:</w:t>
+      </w:r>
+    </w:p>
+    <w:tbl>
+      <w:tblPr>
+        <w:tblStyle w:val="LightGrid-Accent1"/>
+        <w:tblW w:type="auto" w:w="0"/>
+        <w:tblLook w:firstColumn="1" w:firstRow="1" w:lastColumn="0" w:lastRow="0" w:noHBand="0" w:noVBand="1" w:val="04A0"/>
+      </w:tblPr>
+      <w:tblGrid>
+        <w:gridCol w:w="5112"/>
+        <w:gridCol w:w="5112"/>
+      </w:tblGrid>
+      <w:tr>
+        <w:tc>
+          <w:tcPr>
+            <w:tcW w:type="dxa" w:w="5112"/>
+            <w:shd w:val="clear" w:color="auto" w:fill="D9E1F2"/>
+          </w:tcPr>
+          <w:p>
+            <w:r/>
+            <w:r>
+              <w:rPr>
+                <w:b/>
+                <w:sz w:val="18"/>
+              </w:rPr>
+              <w:t>Doc</w:t>
+            </w:r>
+          </w:p>
+        </w:tc>
+        <w:tc>
+          <w:tcPr>
+            <w:tcW w:type="dxa" w:w="5112"/>
+            <w:shd w:val="clear" w:color="auto" w:fill="D9E1F2"/>
+          </w:tcPr>
+          <w:p>
+            <w:r/>
+            <w:r>
+              <w:rPr>
+                <w:b/>
+                <w:sz w:val="18"/>
+              </w:rPr>
+              <w:t>Role</w:t>
+            </w:r>
+          </w:p>
+        </w:tc>
+      </w:tr>
+      <w:tr>
+        <w:tc>
+          <w:tcPr>
+            <w:tcW w:type="dxa" w:w="5112"/>
+          </w:tcPr>
+          <w:p>
+            <w:r>
+              <w:rPr>
+                <w:sz w:val="18"/>
+              </w:rPr>
+            </w:r>
+            <w:r>
+              <w:rPr>
+                <w:rFonts w:ascii="Consolas" w:hAnsi="Consolas"/>
+                <w:sz w:val="18"/>
+              </w:rPr>
+              <w:t>docs/architecture/STEP14_PLAN.md</w:t>
+            </w:r>
+          </w:p>
+        </w:tc>
+        <w:tc>
+          <w:tcPr>
+            <w:tcW w:type="dxa" w:w="5112"/>
+          </w:tcPr>
+          <w:p>
+            <w:r>
+              <w:rPr>
+                <w:sz w:val="18"/>
+              </w:rPr>
+            </w:r>
+            <w:r>
+              <w:rPr>
+                <w:b/>
+                <w:sz w:val="18"/>
+              </w:rPr>
+              <w:t>Engineering blueprint.</w:t>
+            </w:r>
+            <w:r>
+              <w:rPr>
+                <w:sz w:val="18"/>
+              </w:rPr>
+              <w:t xml:space="preserve"> What each of Stages 1-10 technically does — code structure, reference behaviors to mirror, files touched, expected wire effects. Pre-existing, unchanged. The "WHAT."</w:t>
+            </w:r>
+          </w:p>
+        </w:tc>
+      </w:tr>
+      <w:tr>
+        <w:tc>
+          <w:tcPr>
+            <w:tcW w:type="dxa" w:w="5112"/>
+          </w:tcPr>
+          <w:p>
+            <w:r>
+              <w:rPr>
+                <w:sz w:val="18"/>
+              </w:rPr>
+            </w:r>
+            <w:r>
+              <w:rPr>
+                <w:rFonts w:ascii="Consolas" w:hAnsi="Consolas"/>
+                <w:sz w:val="18"/>
+              </w:rPr>
+              <w:t>docs/EXECUTION_PLAN.md</w:t>
+            </w:r>
+            <w:r>
+              <w:rPr>
+                <w:sz w:val="18"/>
+              </w:rPr>
+              <w:t xml:space="preserve"> *(this file)*</w:t>
+            </w:r>
+          </w:p>
+        </w:tc>
+        <w:tc>
+          <w:tcPr>
+            <w:tcW w:type="dxa" w:w="5112"/>
+          </w:tcPr>
+          <w:p>
+            <w:r>
+              <w:rPr>
+                <w:sz w:val="18"/>
+              </w:rPr>
+            </w:r>
+            <w:r>
+              <w:rPr>
+                <w:b/>
+                <w:sz w:val="18"/>
+              </w:rPr>
+              <w:t>Operating discipline + progress tracking.</w:t>
+            </w:r>
+            <w:r>
+              <w:rPr>
+                <w:sz w:val="18"/>
+              </w:rPr>
+              <w:t xml:space="preserve"> Locked rules, pre-write verification protocol, 2-audit gate, §3.9 sign-off registry, per-stage checklists, STOP-AND-ASK queue, verification log. The "HOW we execute + what gates each step."</w:t>
+            </w:r>
+          </w:p>
+        </w:tc>
+      </w:tr>
+    </w:tbl>
+    <w:p/>
+    <w:p>
+      <w:r>
+        <w:t>For any given stage:</w:t>
+      </w:r>
+    </w:p>
+    <w:p>
+      <w:pPr>
+        <w:pStyle w:val="ListNumber"/>
+        <w:ind w:left="360"/>
+      </w:pPr>
+      <w:r>
+        <w:t xml:space="preserve">Read </w:t>
+      </w:r>
+      <w:r>
+        <w:rPr>
+          <w:rFonts w:ascii="Consolas" w:hAnsi="Consolas"/>
+          <w:sz w:val="18"/>
+        </w:rPr>
+        <w:t>STEP14_PLAN.md §Stage N</w:t>
+      </w:r>
+      <w:r>
+        <w:t xml:space="preserve"> — the engineering spec.</w:t>
+      </w:r>
+    </w:p>
+    <w:p>
+      <w:pPr>
+        <w:pStyle w:val="ListNumber"/>
+        <w:ind w:left="360"/>
+      </w:pPr>
+      <w:r>
+        <w:t xml:space="preserve">Read this file's </w:t>
+      </w:r>
+      <w:r>
+        <w:rPr>
+          <w:rFonts w:ascii="Consolas" w:hAnsi="Consolas"/>
+          <w:sz w:val="18"/>
+        </w:rPr>
+        <w:t>§Stage N</w:t>
+      </w:r>
+      <w:r>
+        <w:t xml:space="preserve"> checklist — the operational gates.</w:t>
+      </w:r>
+    </w:p>
+    <w:p>
+      <w:pPr>
+        <w:pStyle w:val="ListNumber"/>
+        <w:ind w:left="360"/>
+      </w:pPr>
+      <w:r>
+        <w:t>Follow the Pre-Write Protocol below → write code → Audit #1 → Audit #2 → mark checkbox → commit → re-sync DOCX/PDF.</w:t>
+      </w:r>
+    </w:p>
+    <w:p>
+      <w:r>
+        <w:rPr>
+          <w:b/>
+        </w:rPr>
+        <w:t>No checkbox in this file is marked complete until BOTH the engineering spec (STEP14_PLAN.md §Stage N) is satisfied AND the 2-audit gate (Rule 6 below) is satisfied.</w:t>
+      </w:r>
+      <w:r>
+        <w:t xml:space="preserve"> Bench-passing alone is necessary but not sufficient.</w:t>
+      </w:r>
+    </w:p>
+    <w:p>
+      <w:r>
+        <w:t>This file is the answer to two operator questions:</w:t>
+      </w:r>
+    </w:p>
+    <w:p>
+      <w:pPr>
+        <w:pStyle w:val="ListBullet"/>
+        <w:ind w:left="360"/>
+      </w:pPr>
+      <w:r>
+        <w:rPr>
+          <w:b/>
+        </w:rPr>
+        <w:t>"What happens before any code is written?"</w:t>
+      </w:r>
+      <w:r>
+        <w:t xml:space="preserve"> → Pre-Write Protocol (Verification Protocol §1-6) + Rule 3 (read reference twice) + Rule 4 (STOP-AND-ASK if unsure).</w:t>
+      </w:r>
+    </w:p>
+    <w:p>
+      <w:pPr>
+        <w:pStyle w:val="ListBullet"/>
+        <w:ind w:left="360"/>
+      </w:pPr>
+      <w:r>
+        <w:rPr>
+          <w:b/>
+        </w:rPr>
+        <w:t>"What happens before anything is confirmed as PARITY-LIKE-REFERENCE?"</w:t>
+      </w:r>
+      <w:r>
+        <w:t xml:space="preserve"> → 2-audit gate (Rule 6) + Verification Protocol §10-12 + (for bench-gated stages) operator bench sign-off §14-15.</w:t>
       </w:r>
     </w:p>
     <w:p>
@@ -6258,7 +6539,7 @@
         <w:color w:val="808080"/>
         <w:sz w:val="16"/>
       </w:rPr>
-      <w:t>Lyra-cpp Execution Plan — auto-generated 2026-06-06 20:37 (source: docs/EXECUTION_PLAN.md)</w:t>
+      <w:t>Lyra-cpp Execution Plan — auto-generated 2026-06-06 20:41 (source: docs/EXECUTION_PLAN.md)</w:t>
     </w:r>
   </w:p>
 </w:hdr>

</xml_diff>

<commit_message>
docs: §3.9 registry — all 5 reverts SHIPPED, commit shas recorded
Updates the §3.9 registry status column from 🔴 REVERT TO REFERENCE
(operator-rejected 2026-06-06) to ✅ REVERTED 2026-06-07 with the
specific commit sha for each item.

Action-queue table updated to reflect where the reverts actually
landed (LIVE hl2_stream.cpp + .h + settingsdialog.cpp + CMakeLists,
NOT the future Ep6RecvThread.cpp which was already reference-faithful).

Commit map:
  §3.9-1            → 3b7888b  (seq mask 20-bit → 32-bit)
  §3.9-2/3/4        → 42f66c2  (telemetry slot map → reference)
  §3.9-5            → 12e7acc  (MoxEdgeFade DELETED, 336 LOC + UI)

Task #115 complete.  Step 14 reference-parity baseline restored;
Stages 5 + 8 audit-fold pre-work for these items is now NO-OP.

Regenerated DOCX (60 KB) + PDF (52 KB).

Co-Authored-By: Claude Opus 4.7 (1M context) <noreply@anthropic.com>
</commit_message>
<xml_diff>
--- a/docs/EXECUTION_PLAN.docx
+++ b/docs/EXECUTION_PLAN.docx
@@ -5108,20 +5108,33 @@
               <w:rPr>
                 <w:sz w:val="18"/>
               </w:rPr>
-              <w:t xml:space="preserve">🔴 </w:t>
+              <w:t xml:space="preserve">✅ </w:t>
             </w:r>
             <w:r>
               <w:rPr>
                 <w:b/>
                 <w:sz w:val="18"/>
               </w:rPr>
-              <w:t>REVERT TO REFERENCE</w:t>
-            </w:r>
-            <w:r>
-              <w:rPr>
-                <w:sz w:val="18"/>
-              </w:rPr>
-              <w:t xml:space="preserve"> — operator rejected 2026-06-06</w:t>
+              <w:t>REVERTED 2026-06-07</w:t>
+            </w:r>
+            <w:r>
+              <w:rPr>
+                <w:sz w:val="18"/>
+              </w:rPr>
+              <w:t xml:space="preserve"> — commit </w:t>
+            </w:r>
+            <w:r>
+              <w:rPr>
+                <w:rFonts w:ascii="Consolas" w:hAnsi="Consolas"/>
+                <w:sz w:val="18"/>
+              </w:rPr>
+              <w:t>3b7888b</w:t>
+            </w:r>
+            <w:r>
+              <w:rPr>
+                <w:sz w:val="18"/>
+              </w:rPr>
+              <w:t xml:space="preserve"> (Task #115)</w:t>
             </w:r>
           </w:p>
         </w:tc>
@@ -5240,20 +5253,33 @@
               <w:rPr>
                 <w:sz w:val="18"/>
               </w:rPr>
-              <w:t xml:space="preserve">🔴 </w:t>
+              <w:t xml:space="preserve">✅ </w:t>
             </w:r>
             <w:r>
               <w:rPr>
                 <w:b/>
                 <w:sz w:val="18"/>
               </w:rPr>
-              <w:t>REVERT TO REFERENCE</w:t>
-            </w:r>
-            <w:r>
-              <w:rPr>
-                <w:sz w:val="18"/>
-              </w:rPr>
-              <w:t xml:space="preserve"> — operator rejected 2026-06-06</w:t>
+              <w:t>REVERTED 2026-06-07</w:t>
+            </w:r>
+            <w:r>
+              <w:rPr>
+                <w:sz w:val="18"/>
+              </w:rPr>
+              <w:t xml:space="preserve"> — commit </w:t>
+            </w:r>
+            <w:r>
+              <w:rPr>
+                <w:rFonts w:ascii="Consolas" w:hAnsi="Consolas"/>
+                <w:sz w:val="18"/>
+              </w:rPr>
+              <w:t>42f66c2</w:t>
+            </w:r>
+            <w:r>
+              <w:rPr>
+                <w:sz w:val="18"/>
+              </w:rPr>
+              <w:t xml:space="preserve"> (Task #115)</w:t>
             </w:r>
           </w:p>
         </w:tc>
@@ -5352,20 +5378,33 @@
               <w:rPr>
                 <w:sz w:val="18"/>
               </w:rPr>
-              <w:t xml:space="preserve">🔴 </w:t>
+              <w:t xml:space="preserve">✅ </w:t>
             </w:r>
             <w:r>
               <w:rPr>
                 <w:b/>
                 <w:sz w:val="18"/>
               </w:rPr>
-              <w:t>REVERT TO REFERENCE</w:t>
-            </w:r>
-            <w:r>
-              <w:rPr>
-                <w:sz w:val="18"/>
-              </w:rPr>
-              <w:t xml:space="preserve"> — operator rejected 2026-06-06</w:t>
+              <w:t>REVERTED 2026-06-07</w:t>
+            </w:r>
+            <w:r>
+              <w:rPr>
+                <w:sz w:val="18"/>
+              </w:rPr>
+              <w:t xml:space="preserve"> — commit </w:t>
+            </w:r>
+            <w:r>
+              <w:rPr>
+                <w:rFonts w:ascii="Consolas" w:hAnsi="Consolas"/>
+                <w:sz w:val="18"/>
+              </w:rPr>
+              <w:t>42f66c2</w:t>
+            </w:r>
+            <w:r>
+              <w:rPr>
+                <w:sz w:val="18"/>
+              </w:rPr>
+              <w:t xml:space="preserve"> (Task #115)</w:t>
             </w:r>
           </w:p>
         </w:tc>
@@ -5484,20 +5523,33 @@
               <w:rPr>
                 <w:sz w:val="18"/>
               </w:rPr>
-              <w:t xml:space="preserve">🔴 </w:t>
+              <w:t xml:space="preserve">✅ </w:t>
             </w:r>
             <w:r>
               <w:rPr>
                 <w:b/>
                 <w:sz w:val="18"/>
               </w:rPr>
-              <w:t>REVERT TO REFERENCE</w:t>
-            </w:r>
-            <w:r>
-              <w:rPr>
-                <w:sz w:val="18"/>
-              </w:rPr>
-              <w:t xml:space="preserve"> — operator rejected 2026-06-06</w:t>
+              <w:t>REVERTED 2026-06-07</w:t>
+            </w:r>
+            <w:r>
+              <w:rPr>
+                <w:sz w:val="18"/>
+              </w:rPr>
+              <w:t xml:space="preserve"> — commit </w:t>
+            </w:r>
+            <w:r>
+              <w:rPr>
+                <w:rFonts w:ascii="Consolas" w:hAnsi="Consolas"/>
+                <w:sz w:val="18"/>
+              </w:rPr>
+              <w:t>42f66c2</w:t>
+            </w:r>
+            <w:r>
+              <w:rPr>
+                <w:sz w:val="18"/>
+              </w:rPr>
+              <w:t xml:space="preserve"> (Task #115)</w:t>
             </w:r>
           </w:p>
         </w:tc>
@@ -5635,20 +5687,33 @@
               <w:rPr>
                 <w:sz w:val="18"/>
               </w:rPr>
-              <w:t xml:space="preserve">🔴 </w:t>
+              <w:t xml:space="preserve">✅ </w:t>
             </w:r>
             <w:r>
               <w:rPr>
                 <w:b/>
                 <w:sz w:val="18"/>
               </w:rPr>
-              <w:t>REVERT TO REFERENCE</w:t>
-            </w:r>
-            <w:r>
-              <w:rPr>
-                <w:sz w:val="18"/>
-              </w:rPr>
-              <w:t xml:space="preserve"> — operator rejected 2026-06-06 (SSB gets NO envelope shaping, period)</w:t>
+              <w:t>REVERTED 2026-06-07</w:t>
+            </w:r>
+            <w:r>
+              <w:rPr>
+                <w:sz w:val="18"/>
+              </w:rPr>
+              <w:t xml:space="preserve"> — commit </w:t>
+            </w:r>
+            <w:r>
+              <w:rPr>
+                <w:rFonts w:ascii="Consolas" w:hAnsi="Consolas"/>
+                <w:sz w:val="18"/>
+              </w:rPr>
+              <w:t>12e7acc</w:t>
+            </w:r>
+            <w:r>
+              <w:rPr>
+                <w:sz w:val="18"/>
+              </w:rPr>
+              <w:t xml:space="preserve"> (Task #115). 336 LOC DELETED + FSM rewire + Settings UI removed. Operator confirmed amp-safety call: rfDelayMs_ (50 ms default) is now sole hot-switch protection, matching reference.</w:t>
             </w:r>
           </w:p>
         </w:tc>
@@ -5660,7 +5725,20 @@
         <w:rPr>
           <w:b/>
         </w:rPr>
-        <w:t>Action queued (do NOT auto-execute — surface per-stage as the relevant Step 14 stage starts):</w:t>
+        <w:t>All 5 reverts shipped Step 14 Stage 1.5 (pre-Stage-2 pass).</w:t>
+      </w:r>
+      <w:r>
+        <w:t xml:space="preserve"> The locations originally tagged Stage 5 / Stage 8 below were preemptive — the LIVE production hl2_stream.cpp carried the patches directly, and reverting in-place restores reference parity for the active code path. The clean </w:t>
+      </w:r>
+      <w:r>
+        <w:rPr>
+          <w:rFonts w:ascii="Consolas" w:hAnsi="Consolas"/>
+          <w:sz w:val="18"/>
+        </w:rPr>
+        <w:t>src/wire/Ep6RecvThread.cpp</w:t>
+      </w:r>
+      <w:r>
+        <w:t xml:space="preserve"> was already reference-faithful (no §3.9-1 mask, reference-verbatim slot decode) and required no edits.</w:t>
       </w:r>
     </w:p>
     <w:tbl>
@@ -5703,7 +5781,7 @@
                 <w:b/>
                 <w:sz w:val="18"/>
               </w:rPr>
-              <w:t>Where the revert lands</w:t>
+              <w:t>Where the revert landed</w:t>
             </w:r>
           </w:p>
         </w:tc>
@@ -5719,7 +5797,7 @@
                 <w:b/>
                 <w:sz w:val="18"/>
               </w:rPr>
-              <w:t>Step 14 stage</w:t>
+              <w:t>Reference cite</w:t>
             </w:r>
           </w:p>
         </w:tc>
@@ -5758,20 +5836,26 @@
                 <w:rFonts w:ascii="Consolas" w:hAnsi="Consolas"/>
                 <w:sz w:val="18"/>
               </w:rPr>
-              <w:t>Ep6RecvThread</w:t>
-            </w:r>
-            <w:r>
-              <w:rPr>
-                <w:sz w:val="18"/>
-              </w:rPr>
-              <w:t xml:space="preserve"> seq read — use full 32-bit per </w:t>
+              <w:t>hl2_stream.cpp</w:t>
+            </w:r>
+            <w:r>
+              <w:rPr>
+                <w:sz w:val="18"/>
+              </w:rPr>
+              <w:t xml:space="preserve"> — </w:t>
             </w:r>
             <w:r>
               <w:rPr>
                 <w:rFonts w:ascii="Consolas" w:hAnsi="Consolas"/>
                 <w:sz w:val="18"/>
               </w:rPr>
-              <w:t>networkproto1.c:191-194</w:t>
+              <w:t>expectedSeq = seq + 1</w:t>
+            </w:r>
+            <w:r>
+              <w:rPr>
+                <w:sz w:val="18"/>
+              </w:rPr>
+              <w:t xml:space="preserve"> (no mask)</w:t>
             </w:r>
           </w:p>
         </w:tc>
@@ -5787,9 +5871,16 @@
             </w:r>
             <w:r>
               <w:rPr>
-                <w:sz w:val="18"/>
-              </w:rPr>
-              <w:t>Stage 5 (RX wire-up)</w:t>
+                <w:rFonts w:ascii="Consolas" w:hAnsi="Consolas"/>
+                <w:sz w:val="18"/>
+              </w:rPr>
+              <w:t>networkproto1.c:191-194</w:t>
+            </w:r>
+            <w:r>
+              <w:rPr>
+                <w:sz w:val="18"/>
+              </w:rPr>
+              <w:t xml:space="preserve"> MetisReadDirect</w:t>
             </w:r>
           </w:p>
         </w:tc>
@@ -5828,26 +5919,39 @@
                 <w:rFonts w:ascii="Consolas" w:hAnsi="Consolas"/>
                 <w:sz w:val="18"/>
               </w:rPr>
-              <w:t>Ep6RecvThread::decode_status_header</w:t>
-            </w:r>
-            <w:r>
-              <w:rPr>
-                <w:sz w:val="18"/>
-              </w:rPr>
-              <w:t xml:space="preserve"> slot map per </w:t>
+              <w:t>hl2_stream.cpp</w:t>
+            </w:r>
+            <w:r>
+              <w:rPr>
+                <w:sz w:val="18"/>
+              </w:rPr>
+              <w:t xml:space="preserve"> slot decode + </w:t>
             </w:r>
             <w:r>
               <w:rPr>
                 <w:rFonts w:ascii="Consolas" w:hAnsi="Consolas"/>
                 <w:sz w:val="18"/>
               </w:rPr>
-              <w:t>networkproto1.c:498-518</w:t>
-            </w:r>
-            <w:r>
-              <w:rPr>
-                <w:sz w:val="18"/>
-              </w:rPr>
-              <w:t xml:space="preserve"> (HL2 read loop)</w:t>
+              <w:t>hl2_stream.h</w:t>
+            </w:r>
+            <w:r>
+              <w:rPr>
+                <w:sz w:val="18"/>
+              </w:rPr>
+              <w:t xml:space="preserve"> atomics; </w:t>
+            </w:r>
+            <w:r>
+              <w:rPr>
+                <w:rFonts w:ascii="Consolas" w:hAnsi="Consolas"/>
+                <w:sz w:val="18"/>
+              </w:rPr>
+              <w:t>hl2TempC()</w:t>
+            </w:r>
+            <w:r>
+              <w:rPr>
+                <w:sz w:val="18"/>
+              </w:rPr>
+              <w:t xml:space="preserve"> returns NaN (HL2 board temp is I2C2, separate work item)</w:t>
             </w:r>
           </w:p>
         </w:tc>
@@ -5863,9 +5967,16 @@
             </w:r>
             <w:r>
               <w:rPr>
-                <w:sz w:val="18"/>
-              </w:rPr>
-              <w:t>Stage 5 (RX wire-up)</w:t>
+                <w:rFonts w:ascii="Consolas" w:hAnsi="Consolas"/>
+                <w:sz w:val="18"/>
+              </w:rPr>
+              <w:t>networkproto1.c:498-525</w:t>
+            </w:r>
+            <w:r>
+              <w:rPr>
+                <w:sz w:val="18"/>
+              </w:rPr>
+              <w:t xml:space="preserve"> HL2 read loop</w:t>
             </w:r>
           </w:p>
         </w:tc>
@@ -5901,35 +6012,42 @@
             </w:r>
             <w:r>
               <w:rPr>
-                <w:sz w:val="18"/>
-              </w:rPr>
-              <w:t xml:space="preserve">DELETE </w:t>
-            </w:r>
-            <w:r>
-              <w:rPr>
                 <w:rFonts w:ascii="Consolas" w:hAnsi="Consolas"/>
                 <w:sz w:val="18"/>
               </w:rPr>
-              <w:t>src/mox_edge_fade.cpp</w:t>
-            </w:r>
-            <w:r>
-              <w:rPr>
-                <w:sz w:val="18"/>
-              </w:rPr>
-              <w:t xml:space="preserve"> + its caller; SSB MoxEdge path becomes a no-op per WDSP </w:t>
+              <w:t>src/mox_edge_fade.{cpp,h}</w:t>
+            </w:r>
+            <w:r>
+              <w:rPr>
+                <w:sz w:val="18"/>
+              </w:rPr>
+              <w:t xml:space="preserve"> DELETED; </w:t>
             </w:r>
             <w:r>
               <w:rPr>
                 <w:rFonts w:ascii="Consolas" w:hAnsi="Consolas"/>
                 <w:sz w:val="18"/>
               </w:rPr>
-              <w:t>TXAUslewCheck</w:t>
-            </w:r>
-            <w:r>
-              <w:rPr>
-                <w:sz w:val="18"/>
-              </w:rPr>
-              <w:t xml:space="preserve"> semantics</w:t>
+              <w:t>hl2_stream.cpp</w:t>
+            </w:r>
+            <w:r>
+              <w:rPr>
+                <w:sz w:val="18"/>
+              </w:rPr>
+              <w:t xml:space="preserve"> FSM </w:t>
+            </w:r>
+            <w:r>
+              <w:rPr>
+                <w:rFonts w:ascii="Consolas" w:hAnsi="Consolas"/>
+                <w:sz w:val="18"/>
+              </w:rPr>
+              <w:t>fsmKeyupTxOff()</w:t>
+            </w:r>
+            <w:r>
+              <w:rPr>
+                <w:sz w:val="18"/>
+              </w:rPr>
+              <w:t xml:space="preserve"> reference-faithful keyup; EP2 packer emits raw TX I/Q</w:t>
             </w:r>
           </w:p>
         </w:tc>
@@ -5945,9 +6063,29 @@
             </w:r>
             <w:r>
               <w:rPr>
-                <w:sz w:val="18"/>
-              </w:rPr>
-              <w:t>Stage 8 (TX wire-up)</w:t>
+                <w:rFonts w:ascii="Consolas" w:hAnsi="Consolas"/>
+                <w:sz w:val="18"/>
+              </w:rPr>
+              <w:t>wdsp/TXA.c:819-824</w:t>
+            </w:r>
+            <w:r>
+              <w:rPr>
+                <w:sz w:val="18"/>
+              </w:rPr>
+              <w:t xml:space="preserve"> </w:t>
+            </w:r>
+            <w:r>
+              <w:rPr>
+                <w:rFonts w:ascii="Consolas" w:hAnsi="Consolas"/>
+                <w:sz w:val="18"/>
+              </w:rPr>
+              <w:t>TXAUslewCheck</w:t>
+            </w:r>
+            <w:r>
+              <w:rPr>
+                <w:sz w:val="18"/>
+              </w:rPr>
+              <w:t xml:space="preserve"> returns 0 for SSB</w:t>
             </w:r>
           </w:p>
         </w:tc>
@@ -10066,7 +10204,7 @@
         <w:color w:val="808080"/>
         <w:sz w:val="16"/>
       </w:rPr>
-      <w:t>Lyra-cpp Execution Plan — auto-generated 2026-06-06 21:03 (source: docs/EXECUTION_PLAN.md)</w:t>
+      <w:t>Lyra-cpp Execution Plan — auto-generated 2026-06-07 11:38 (source: docs/EXECUTION_PLAN.md)</w:t>
     </w:r>
   </w:p>
 </w:hdr>

</xml_diff>

<commit_message>
docs: §3.9 registry — record Audit #2 gate (operator bench-verify PENDING)
Per Rule 27 (2-audit gate per checkbox), each shipped §3.9 revert is
currently Audit #1 ✅ PASS / Audit #2 ⏳ PENDING.  Adds a per-item
Audit #2 gate table to the §3.9 registry section so the bench-gate
items don't get lost between sessions.

Audit #2 = operator-bench-verify on live HL2+.  Each row lists the
specific bench expectation Claude's documented analysis predicts —
operator confirms (✅ SIGNED date) or surfaces a Rule 18 STOP-AND-ASK
if bench shows different behavior than the reference would predict.

The §3.9-N items are NOT considered "complete" per Rule 27 until both
audits pass.

Regenerated DOCX + PDF.

Co-Authored-By: Claude Opus 4.7 (1M context) <noreply@anthropic.com>
</commit_message>
<xml_diff>
--- a/docs/EXECUTION_PLAN.docx
+++ b/docs/EXECUTION_PLAN.docx
@@ -5739,6 +5739,440 @@
       </w:r>
       <w:r>
         <w:t xml:space="preserve"> was already reference-faithful (no §3.9-1 mask, reference-verbatim slot decode) and required no edits.</w:t>
+      </w:r>
+    </w:p>
+    <w:p>
+      <w:r>
+        <w:rPr>
+          <w:b/>
+        </w:rPr>
+        <w:t>Audit gate status per Rule 27 (2-audit gate):</w:t>
+      </w:r>
+    </w:p>
+    <w:tbl>
+      <w:tblPr>
+        <w:tblStyle w:val="LightGrid-Accent1"/>
+        <w:tblW w:type="auto" w:w="0"/>
+        <w:tblLook w:firstColumn="1" w:firstRow="1" w:lastColumn="0" w:lastRow="0" w:noHBand="0" w:noVBand="1" w:val="04A0"/>
+      </w:tblPr>
+      <w:tblGrid>
+        <w:gridCol w:w="3408"/>
+        <w:gridCol w:w="3408"/>
+        <w:gridCol w:w="3408"/>
+      </w:tblGrid>
+      <w:tr>
+        <w:tc>
+          <w:tcPr>
+            <w:tcW w:type="dxa" w:w="3408"/>
+            <w:shd w:val="clear" w:color="auto" w:fill="D9E1F2"/>
+          </w:tcPr>
+          <w:p>
+            <w:r/>
+            <w:r>
+              <w:rPr>
+                <w:b/>
+                <w:sz w:val="18"/>
+              </w:rPr>
+              <w:t>#</w:t>
+            </w:r>
+          </w:p>
+        </w:tc>
+        <w:tc>
+          <w:tcPr>
+            <w:tcW w:type="dxa" w:w="3408"/>
+            <w:shd w:val="clear" w:color="auto" w:fill="D9E1F2"/>
+          </w:tcPr>
+          <w:p>
+            <w:r/>
+            <w:r>
+              <w:rPr>
+                <w:b/>
+                <w:sz w:val="18"/>
+              </w:rPr>
+              <w:t>Audit #1 (Claude side-by-side parity)</w:t>
+            </w:r>
+          </w:p>
+        </w:tc>
+        <w:tc>
+          <w:tcPr>
+            <w:tcW w:type="dxa" w:w="3408"/>
+            <w:shd w:val="clear" w:color="auto" w:fill="D9E1F2"/>
+          </w:tcPr>
+          <w:p>
+            <w:r/>
+            <w:r>
+              <w:rPr>
+                <w:b/>
+                <w:sz w:val="18"/>
+              </w:rPr>
+              <w:t>Audit #2 (operator bench-verify on HL2+)</w:t>
+            </w:r>
+          </w:p>
+        </w:tc>
+      </w:tr>
+      <w:tr>
+        <w:tc>
+          <w:tcPr>
+            <w:tcW w:type="dxa" w:w="3408"/>
+          </w:tcPr>
+          <w:p>
+            <w:r>
+              <w:rPr>
+                <w:sz w:val="18"/>
+              </w:rPr>
+            </w:r>
+            <w:r>
+              <w:rPr>
+                <w:sz w:val="18"/>
+              </w:rPr>
+              <w:t>§3.9-1</w:t>
+            </w:r>
+          </w:p>
+        </w:tc>
+        <w:tc>
+          <w:tcPr>
+            <w:tcW w:type="dxa" w:w="3408"/>
+          </w:tcPr>
+          <w:p>
+            <w:r>
+              <w:rPr>
+                <w:sz w:val="18"/>
+              </w:rPr>
+            </w:r>
+            <w:r>
+              <w:rPr>
+                <w:sz w:val="18"/>
+              </w:rPr>
+              <w:t xml:space="preserve">✅ PASS (commit </w:t>
+            </w:r>
+            <w:r>
+              <w:rPr>
+                <w:rFonts w:ascii="Consolas" w:hAnsi="Consolas"/>
+                <w:sz w:val="18"/>
+              </w:rPr>
+              <w:t>3b7888b</w:t>
+            </w:r>
+            <w:r>
+              <w:rPr>
+                <w:sz w:val="18"/>
+              </w:rPr>
+              <w:t xml:space="preserve"> — file:line cited on both trees in commit message)</w:t>
+            </w:r>
+          </w:p>
+        </w:tc>
+        <w:tc>
+          <w:tcPr>
+            <w:tcW w:type="dxa" w:w="3408"/>
+          </w:tcPr>
+          <w:p>
+            <w:r>
+              <w:rPr>
+                <w:sz w:val="18"/>
+              </w:rPr>
+            </w:r>
+            <w:r>
+              <w:rPr>
+                <w:sz w:val="18"/>
+              </w:rPr>
+              <w:t>⏳ PENDING — operator next-bench run; verify EP6 seq error counter behaves sensibly (may tick once every ~3:27 min on the ak4951v4 20-bit gateware wrap — that is now the correctly-flagged event, not a false alarm)</w:t>
+            </w:r>
+          </w:p>
+        </w:tc>
+      </w:tr>
+      <w:tr>
+        <w:tc>
+          <w:tcPr>
+            <w:tcW w:type="dxa" w:w="3408"/>
+          </w:tcPr>
+          <w:p>
+            <w:r>
+              <w:rPr>
+                <w:sz w:val="18"/>
+              </w:rPr>
+            </w:r>
+            <w:r>
+              <w:rPr>
+                <w:sz w:val="18"/>
+              </w:rPr>
+              <w:t>§3.9-2</w:t>
+            </w:r>
+          </w:p>
+        </w:tc>
+        <w:tc>
+          <w:tcPr>
+            <w:tcW w:type="dxa" w:w="3408"/>
+          </w:tcPr>
+          <w:p>
+            <w:r>
+              <w:rPr>
+                <w:sz w:val="18"/>
+              </w:rPr>
+            </w:r>
+            <w:r>
+              <w:rPr>
+                <w:sz w:val="18"/>
+              </w:rPr>
+              <w:t xml:space="preserve">✅ PASS (commit </w:t>
+            </w:r>
+            <w:r>
+              <w:rPr>
+                <w:rFonts w:ascii="Consolas" w:hAnsi="Consolas"/>
+                <w:sz w:val="18"/>
+              </w:rPr>
+              <w:t>42f66c2</w:t>
+            </w:r>
+            <w:r>
+              <w:rPr>
+                <w:sz w:val="18"/>
+              </w:rPr>
+              <w:t>)</w:t>
+            </w:r>
+          </w:p>
+        </w:tc>
+        <w:tc>
+          <w:tcPr>
+            <w:tcW w:type="dxa" w:w="3408"/>
+          </w:tcPr>
+          <w:p>
+            <w:r>
+              <w:rPr>
+                <w:sz w:val="18"/>
+              </w:rPr>
+            </w:r>
+            <w:r>
+              <w:rPr>
+                <w:sz w:val="18"/>
+              </w:rPr>
+              <w:t xml:space="preserve">⏳ PENDING — verify banner "T" reads </w:t>
+            </w:r>
+            <w:r>
+              <w:rPr>
+                <w:rFonts w:ascii="Consolas" w:hAnsi="Consolas"/>
+                <w:sz w:val="18"/>
+              </w:rPr>
+              <w:t>n/a</w:t>
+            </w:r>
+            <w:r>
+              <w:rPr>
+                <w:sz w:val="18"/>
+              </w:rPr>
+              <w:t xml:space="preserve"> (reference has no EP6 temp; HL2 board temp is I2C2, separate future work)</w:t>
+            </w:r>
+          </w:p>
+        </w:tc>
+      </w:tr>
+      <w:tr>
+        <w:tc>
+          <w:tcPr>
+            <w:tcW w:type="dxa" w:w="3408"/>
+          </w:tcPr>
+          <w:p>
+            <w:r>
+              <w:rPr>
+                <w:sz w:val="18"/>
+              </w:rPr>
+            </w:r>
+            <w:r>
+              <w:rPr>
+                <w:sz w:val="18"/>
+              </w:rPr>
+              <w:t>§3.9-3</w:t>
+            </w:r>
+          </w:p>
+        </w:tc>
+        <w:tc>
+          <w:tcPr>
+            <w:tcW w:type="dxa" w:w="3408"/>
+          </w:tcPr>
+          <w:p>
+            <w:r>
+              <w:rPr>
+                <w:sz w:val="18"/>
+              </w:rPr>
+            </w:r>
+            <w:r>
+              <w:rPr>
+                <w:sz w:val="18"/>
+              </w:rPr>
+              <w:t xml:space="preserve">✅ PASS (commit </w:t>
+            </w:r>
+            <w:r>
+              <w:rPr>
+                <w:rFonts w:ascii="Consolas" w:hAnsi="Consolas"/>
+                <w:sz w:val="18"/>
+              </w:rPr>
+              <w:t>42f66c2</w:t>
+            </w:r>
+            <w:r>
+              <w:rPr>
+                <w:sz w:val="18"/>
+              </w:rPr>
+              <w:t>)</w:t>
+            </w:r>
+          </w:p>
+        </w:tc>
+        <w:tc>
+          <w:tcPr>
+            <w:tcW w:type="dxa" w:w="3408"/>
+          </w:tcPr>
+          <w:p>
+            <w:r>
+              <w:rPr>
+                <w:sz w:val="18"/>
+              </w:rPr>
+            </w:r>
+            <w:r>
+              <w:rPr>
+                <w:sz w:val="18"/>
+              </w:rPr>
+              <w:t>⏳ PENDING — verify banner "V" + new "PA Volts" Q_PROPERTY behave sensibly on ak4951v4 (may need scale calibration if gateware returns different raw values from generic HL2)</w:t>
+            </w:r>
+          </w:p>
+        </w:tc>
+      </w:tr>
+      <w:tr>
+        <w:tc>
+          <w:tcPr>
+            <w:tcW w:type="dxa" w:w="3408"/>
+          </w:tcPr>
+          <w:p>
+            <w:r>
+              <w:rPr>
+                <w:sz w:val="18"/>
+              </w:rPr>
+            </w:r>
+            <w:r>
+              <w:rPr>
+                <w:sz w:val="18"/>
+              </w:rPr>
+              <w:t>§3.9-4</w:t>
+            </w:r>
+          </w:p>
+        </w:tc>
+        <w:tc>
+          <w:tcPr>
+            <w:tcW w:type="dxa" w:w="3408"/>
+          </w:tcPr>
+          <w:p>
+            <w:r>
+              <w:rPr>
+                <w:sz w:val="18"/>
+              </w:rPr>
+            </w:r>
+            <w:r>
+              <w:rPr>
+                <w:sz w:val="18"/>
+              </w:rPr>
+              <w:t xml:space="preserve">✅ PASS (commit </w:t>
+            </w:r>
+            <w:r>
+              <w:rPr>
+                <w:rFonts w:ascii="Consolas" w:hAnsi="Consolas"/>
+                <w:sz w:val="18"/>
+              </w:rPr>
+              <w:t>42f66c2</w:t>
+            </w:r>
+            <w:r>
+              <w:rPr>
+                <w:sz w:val="18"/>
+              </w:rPr>
+              <w:t>)</w:t>
+            </w:r>
+          </w:p>
+        </w:tc>
+        <w:tc>
+          <w:tcPr>
+            <w:tcW w:type="dxa" w:w="3408"/>
+          </w:tcPr>
+          <w:p>
+            <w:r>
+              <w:rPr>
+                <w:sz w:val="18"/>
+              </w:rPr>
+            </w:r>
+            <w:r>
+              <w:rPr>
+                <w:sz w:val="18"/>
+              </w:rPr>
+              <w:t>⏳ PENDING — verify banner "PA" (now reading slot 0x18 C1:C2 = user_adc1 per reference) reads correctly at full tune (~1.8 A reference anchor)</w:t>
+            </w:r>
+          </w:p>
+        </w:tc>
+      </w:tr>
+      <w:tr>
+        <w:tc>
+          <w:tcPr>
+            <w:tcW w:type="dxa" w:w="3408"/>
+          </w:tcPr>
+          <w:p>
+            <w:r>
+              <w:rPr>
+                <w:sz w:val="18"/>
+              </w:rPr>
+            </w:r>
+            <w:r>
+              <w:rPr>
+                <w:sz w:val="18"/>
+              </w:rPr>
+              <w:t>§3.9-5</w:t>
+            </w:r>
+          </w:p>
+        </w:tc>
+        <w:tc>
+          <w:tcPr>
+            <w:tcW w:type="dxa" w:w="3408"/>
+          </w:tcPr>
+          <w:p>
+            <w:r>
+              <w:rPr>
+                <w:sz w:val="18"/>
+              </w:rPr>
+            </w:r>
+            <w:r>
+              <w:rPr>
+                <w:sz w:val="18"/>
+              </w:rPr>
+              <w:t xml:space="preserve">✅ PASS (commit </w:t>
+            </w:r>
+            <w:r>
+              <w:rPr>
+                <w:rFonts w:ascii="Consolas" w:hAnsi="Consolas"/>
+                <w:sz w:val="18"/>
+              </w:rPr>
+              <w:t>12e7acc</w:t>
+            </w:r>
+            <w:r>
+              <w:rPr>
+                <w:sz w:val="18"/>
+              </w:rPr>
+              <w:t>)</w:t>
+            </w:r>
+          </w:p>
+        </w:tc>
+        <w:tc>
+          <w:tcPr>
+            <w:tcW w:type="dxa" w:w="3408"/>
+          </w:tcPr>
+          <w:p>
+            <w:r>
+              <w:rPr>
+                <w:sz w:val="18"/>
+              </w:rPr>
+            </w:r>
+            <w:r>
+              <w:rPr>
+                <w:sz w:val="18"/>
+              </w:rPr>
+              <w:t>⏳ PENDING — verify SSB TX keydown/keyup acoustic behavior; rfDelayMs_ alone is sole hot-switch protection going forward (matches reference)</w:t>
+            </w:r>
+          </w:p>
+        </w:tc>
+      </w:tr>
+    </w:tbl>
+    <w:p/>
+    <w:p>
+      <w:r>
+        <w:t>Per Rule 27 the §3.9-N checkboxes are NOT considered "complete" until both audits pass.  Any FAIL on Audit #2 is a Rule 18 STOP-AND-ASK — surface to operator before any in-place fix.  This file gets updated with "✅ SIGNED {YYYY-MM-DD}" rows when the operator bench-confirms each item.</w:t>
       </w:r>
     </w:p>
     <w:tbl>
@@ -10204,7 +10638,7 @@
         <w:color w:val="808080"/>
         <w:sz w:val="16"/>
       </w:rPr>
-      <w:t>Lyra-cpp Execution Plan — auto-generated 2026-06-07 11:38 (source: docs/EXECUTION_PLAN.md)</w:t>
+      <w:t>Lyra-cpp Execution Plan — auto-generated 2026-06-07 11:49 (source: docs/EXECUTION_PLAN.md)</w:t>
     </w:r>
   </w:p>
 </w:hdr>

</xml_diff>